<commit_message>
ESO Onboarding and Payroll Specialist: rescored 45 -> 61 after confirmations; profile adds new-hire paperwork, timesheet workflows, PTO approvals, bookkeeping, MS Office
Co-Authored-By: Claude Opus 5.5 <noreply@anthropic.com>
Claude-Session: https://claude.ai/code/session_01Tym7Ffe6DkggR3nyAN5h24
</commit_message>
<xml_diff>
--- a/applications/eso-onboarding-payroll-specialist/ESO-OnboardingPayroll-Resume.docx
+++ b/applications/eso-onboarding-payroll-specialist/ESO-OnboardingPayroll-Resume.docx
@@ -31,7 +31,7 @@
           <w:color w:val="555555"/>
           <w:sz w:val="23"/>
         </w:rPr>
-        <w:t>Onboarding &amp; Operations Specialist | Documentation, Deadlines &amp; Data Accuracy</w:t>
+        <w:t>Onboarding &amp; Operations Specialist | New-Hire Paperwork, Timesheets &amp; Deadlines</w:t>
       </w:r>
     </w:p>
     <w:p>
@@ -80,7 +80,7 @@
           <w:i w:val="0"/>
           <w:color w:val="1A1A1A"/>
         </w:rPr>
-        <w:t>Onboarding and operations professional with 15+ years in fast-paced, deadline-driven remote environments. Onboarded 25+ clients per month at Wix while leading a team of onboarding specialists, and have spent my career coordinating timelines between customers and internal teams while keeping records accurate and complete. Experienced Excel user who builds tracking, reporting, and automated workflows that keep high-volume processes on schedule.</w:t>
+        <w:t>Onboarding and operations professional with 15+ years in deadline-driven, high-volume environments. Handled new-hire paperwork (I-9s, W-4s) and employee background checks in a state-regulated business, approved team hours and PTO as a team lead, and set up timesheet-approval workflows for software clients. Experienced in Excel, Word, and Outlook, with basic bookkeeping knowledge.</w:t>
       </w:r>
     </w:p>
     <w:p>
@@ -177,7 +177,7 @@
           <w:i w:val="0"/>
           <w:color w:val="1A1A1A"/>
         </w:rPr>
-        <w:t>Run client onboarding end to end, collecting requirements and documentation, setting timelines, and configuring each client's systems.</w:t>
+        <w:t>Run client onboarding end to end: collect documentation and requirements, set timelines, and configure each client's systems.</w:t>
       </w:r>
     </w:p>
     <w:p>
@@ -202,54 +202,6 @@
           <w:color w:val="1A1A1A"/>
         </w:rPr>
         <w:t>Document every client interaction, timeline, and deliverable in HubSpot, GoHighLevel, and Notion, keeping records auditable across concurrent engagements.</w:t>
-      </w:r>
-    </w:p>
-    <w:p>
-      <w:pPr>
-        <w:spacing w:after="30"/>
-        <w:ind w:left="259" w:hanging="259"/>
-      </w:pPr>
-      <w:r>
-        <w:rPr>
-          <w:rFonts w:ascii="Times New Roman" w:hAnsi="Times New Roman"/>
-          <w:b w:val="0"/>
-          <w:i w:val="0"/>
-          <w:color w:val="1A1A1A"/>
-        </w:rPr>
-        <w:t xml:space="preserve">•  </w:t>
-      </w:r>
-      <w:r>
-        <w:rPr>
-          <w:rFonts w:ascii="Times New Roman" w:hAnsi="Times New Roman"/>
-          <w:b w:val="0"/>
-          <w:i w:val="0"/>
-          <w:color w:val="1A1A1A"/>
-        </w:rPr>
-        <w:t>Build automated intake, reminder, and follow-up workflows that keep deadlines on track without manual chasing.</w:t>
-      </w:r>
-    </w:p>
-    <w:p>
-      <w:pPr>
-        <w:spacing w:after="30"/>
-        <w:ind w:left="259" w:hanging="259"/>
-      </w:pPr>
-      <w:r>
-        <w:rPr>
-          <w:rFonts w:ascii="Times New Roman" w:hAnsi="Times New Roman"/>
-          <w:b w:val="0"/>
-          <w:i w:val="0"/>
-          <w:color w:val="1A1A1A"/>
-        </w:rPr>
-        <w:t xml:space="preserve">•  </w:t>
-      </w:r>
-      <w:r>
-        <w:rPr>
-          <w:rFonts w:ascii="Times New Roman" w:hAnsi="Times New Roman"/>
-          <w:b w:val="0"/>
-          <w:i w:val="0"/>
-          <w:color w:val="1A1A1A"/>
-        </w:rPr>
-        <w:t>Track and report performance in Excel, Power BI, and CRM dashboards on a regular cadence.</w:t>
       </w:r>
     </w:p>
     <w:p>
@@ -304,54 +256,6 @@
           <w:sz w:val="18"/>
         </w:rPr>
         <w:t>Remote</w:t>
-      </w:r>
-    </w:p>
-    <w:p>
-      <w:pPr>
-        <w:spacing w:after="30"/>
-        <w:ind w:left="259" w:hanging="259"/>
-      </w:pPr>
-      <w:r>
-        <w:rPr>
-          <w:rFonts w:ascii="Times New Roman" w:hAnsi="Times New Roman"/>
-          <w:b w:val="0"/>
-          <w:i w:val="0"/>
-          <w:color w:val="1A1A1A"/>
-        </w:rPr>
-        <w:t xml:space="preserve">•  </w:t>
-      </w:r>
-      <w:r>
-        <w:rPr>
-          <w:rFonts w:ascii="Times New Roman" w:hAnsi="Times New Roman"/>
-          <w:b w:val="0"/>
-          <w:i w:val="0"/>
-          <w:color w:val="1A1A1A"/>
-        </w:rPr>
-        <w:t>Coordinated execution across internal departments for multiple client accounts, resolving client feedback promptly to hold delivery quality.</w:t>
-      </w:r>
-    </w:p>
-    <w:p>
-      <w:pPr>
-        <w:spacing w:after="30"/>
-        <w:ind w:left="259" w:hanging="259"/>
-      </w:pPr>
-      <w:r>
-        <w:rPr>
-          <w:rFonts w:ascii="Times New Roman" w:hAnsi="Times New Roman"/>
-          <w:b w:val="0"/>
-          <w:i w:val="0"/>
-          <w:color w:val="1A1A1A"/>
-        </w:rPr>
-        <w:t xml:space="preserve">•  </w:t>
-      </w:r>
-      <w:r>
-        <w:rPr>
-          <w:rFonts w:ascii="Times New Roman" w:hAnsi="Times New Roman"/>
-          <w:b w:val="0"/>
-          <w:i w:val="0"/>
-          <w:color w:val="1A1A1A"/>
-        </w:rPr>
-        <w:t>Advised clients on budget planning and allocation across paid campaigns and reported results against KPIs.</w:t>
       </w:r>
     </w:p>
     <w:p>
@@ -429,31 +333,7 @@
           <w:i w:val="0"/>
           <w:color w:val="1A1A1A"/>
         </w:rPr>
-        <w:t>Onboarded and managed 15-20 reseller partners, guiding each through setup and configuration and retaining all but one (~94%).</w:t>
-      </w:r>
-    </w:p>
-    <w:p>
-      <w:pPr>
-        <w:spacing w:after="30"/>
-        <w:ind w:left="259" w:hanging="259"/>
-      </w:pPr>
-      <w:r>
-        <w:rPr>
-          <w:rFonts w:ascii="Times New Roman" w:hAnsi="Times New Roman"/>
-          <w:b w:val="0"/>
-          <w:i w:val="0"/>
-          <w:color w:val="1A1A1A"/>
-        </w:rPr>
-        <w:t xml:space="preserve">•  </w:t>
-      </w:r>
-      <w:r>
-        <w:rPr>
-          <w:rFonts w:ascii="Times New Roman" w:hAnsi="Times New Roman"/>
-          <w:b w:val="0"/>
-          <w:i w:val="0"/>
-          <w:color w:val="1A1A1A"/>
-        </w:rPr>
-        <w:t>Built automated training and communication sequences that reduced onboarding friction and missed steps.</w:t>
+        <w:t>Onboarded 15-20 reseller partners through setup and configuration, retaining all but one (~94%).</w:t>
       </w:r>
     </w:p>
     <w:p>
@@ -531,31 +411,7 @@
           <w:i w:val="0"/>
           <w:color w:val="1A1A1A"/>
         </w:rPr>
-        <w:t>Led the sales team and rebuilt internal processes that improved reporting accuracy and reduced handoff errors.</w:t>
-      </w:r>
-    </w:p>
-    <w:p>
-      <w:pPr>
-        <w:spacing w:after="30"/>
-        <w:ind w:left="259" w:hanging="259"/>
-      </w:pPr>
-      <w:r>
-        <w:rPr>
-          <w:rFonts w:ascii="Times New Roman" w:hAnsi="Times New Roman"/>
-          <w:b w:val="0"/>
-          <w:i w:val="0"/>
-          <w:color w:val="1A1A1A"/>
-        </w:rPr>
-        <w:t xml:space="preserve">•  </w:t>
-      </w:r>
-      <w:r>
-        <w:rPr>
-          <w:rFonts w:ascii="Times New Roman" w:hAnsi="Times New Roman"/>
-          <w:b w:val="0"/>
-          <w:i w:val="0"/>
-          <w:color w:val="1A1A1A"/>
-        </w:rPr>
-        <w:t>Managed client workflows and tasks in ClickUp against weekly deadlines.</w:t>
+        <w:t>Led the sales team and rebuilt processes that improved reporting accuracy and reduced handoff errors.</w:t>
       </w:r>
     </w:p>
     <w:p>
@@ -633,7 +489,7 @@
           <w:i w:val="0"/>
           <w:color w:val="1A1A1A"/>
         </w:rPr>
-        <w:t>Onboarded and launched 25+ clients per month, holding 110% of implementation targets.</w:t>
+        <w:t>Led a team of onboarding specialists for 2 years (20, later 8): approved hours, PTO, and schedules, and contributed to hiring, onboarding, and training new hires.</w:t>
       </w:r>
     </w:p>
     <w:p>
@@ -657,31 +513,7 @@
           <w:i w:val="0"/>
           <w:color w:val="1A1A1A"/>
         </w:rPr>
-        <w:t>Led a team of onboarding specialists for 2 years (20, later 8), and contributed to hiring, onboarding, and training new hires.</w:t>
-      </w:r>
-    </w:p>
-    <w:p>
-      <w:pPr>
-        <w:spacing w:after="30"/>
-        <w:ind w:left="259" w:hanging="259"/>
-      </w:pPr>
-      <w:r>
-        <w:rPr>
-          <w:rFonts w:ascii="Times New Roman" w:hAnsi="Times New Roman"/>
-          <w:b w:val="0"/>
-          <w:i w:val="0"/>
-          <w:color w:val="1A1A1A"/>
-        </w:rPr>
-        <w:t xml:space="preserve">•  </w:t>
-      </w:r>
-      <w:r>
-        <w:rPr>
-          <w:rFonts w:ascii="Times New Roman" w:hAnsi="Times New Roman"/>
-          <w:b w:val="0"/>
-          <w:i w:val="0"/>
-          <w:color w:val="1A1A1A"/>
-        </w:rPr>
-        <w:t>Labeled and defined the CRM fields required for onboarding workflows, standardizing data capture across the team.</w:t>
+        <w:t>Onboarded and launched 25+ clients per month, holding 110% of implementation targets.</w:t>
       </w:r>
     </w:p>
     <w:p>
@@ -759,7 +591,217 @@
           <w:i w:val="0"/>
           <w:color w:val="1A1A1A"/>
         </w:rPr>
-        <w:t>Guided client onboarding alongside implementation teams, troubleshooting setup issues and escalating risks early.</w:t>
+        <w:t>Set up and walked clients through time-tracking and timesheet-approval workflows in Accelo's platform during scoping and onboarding.</w:t>
+      </w:r>
+    </w:p>
+    <w:p>
+      <w:pPr>
+        <w:tabs>
+          <w:tab w:pos="10512" w:val="right"/>
+        </w:tabs>
+        <w:spacing w:before="80" w:after="20"/>
+      </w:pPr>
+      <w:r>
+        <w:rPr>
+          <w:rFonts w:ascii="Times New Roman" w:hAnsi="Times New Roman"/>
+          <w:b/>
+          <w:i w:val="0"/>
+          <w:color w:val="1A1A1A"/>
+          <w:sz w:val="21"/>
+        </w:rPr>
+        <w:t>Account Executive</w:t>
+      </w:r>
+      <w:r>
+        <w:rPr>
+          <w:rFonts w:ascii="Times New Roman" w:hAnsi="Times New Roman"/>
+          <w:b w:val="0"/>
+          <w:i w:val="0"/>
+          <w:color w:val="1A1A1A"/>
+          <w:sz w:val="21"/>
+        </w:rPr>
+        <w:t xml:space="preserve">  |  Fivestars</w:t>
+      </w:r>
+      <w:r>
+        <w:rPr>
+          <w:rFonts w:ascii="Times New Roman" w:hAnsi="Times New Roman"/>
+          <w:b w:val="0"/>
+          <w:i w:val="0"/>
+          <w:color w:val="555555"/>
+          <w:sz w:val="18"/>
+        </w:rPr>
+        <w:tab/>
+        <w:t>2017 - 2018</w:t>
+      </w:r>
+    </w:p>
+    <w:p>
+      <w:pPr>
+        <w:spacing w:after="20"/>
+      </w:pPr>
+      <w:r>
+        <w:rPr>
+          <w:rFonts w:ascii="Times New Roman" w:hAnsi="Times New Roman"/>
+          <w:b w:val="0"/>
+          <w:i/>
+          <w:color w:val="555555"/>
+          <w:sz w:val="18"/>
+        </w:rPr>
+        <w:t>Denver, CO</w:t>
+      </w:r>
+    </w:p>
+    <w:p>
+      <w:pPr>
+        <w:tabs>
+          <w:tab w:pos="10512" w:val="right"/>
+        </w:tabs>
+        <w:spacing w:before="80" w:after="20"/>
+      </w:pPr>
+      <w:r>
+        <w:rPr>
+          <w:rFonts w:ascii="Times New Roman" w:hAnsi="Times New Roman"/>
+          <w:b/>
+          <w:i w:val="0"/>
+          <w:color w:val="1A1A1A"/>
+          <w:sz w:val="21"/>
+        </w:rPr>
+        <w:t>Business Development Representative</w:t>
+      </w:r>
+      <w:r>
+        <w:rPr>
+          <w:rFonts w:ascii="Times New Roman" w:hAnsi="Times New Roman"/>
+          <w:b w:val="0"/>
+          <w:i w:val="0"/>
+          <w:color w:val="1A1A1A"/>
+          <w:sz w:val="21"/>
+        </w:rPr>
+        <w:t xml:space="preserve">  |  Senior Directory</w:t>
+      </w:r>
+      <w:r>
+        <w:rPr>
+          <w:rFonts w:ascii="Times New Roman" w:hAnsi="Times New Roman"/>
+          <w:b w:val="0"/>
+          <w:i w:val="0"/>
+          <w:color w:val="555555"/>
+          <w:sz w:val="18"/>
+        </w:rPr>
+        <w:tab/>
+        <w:t>2012 - 2016</w:t>
+      </w:r>
+    </w:p>
+    <w:p>
+      <w:pPr>
+        <w:spacing w:after="20"/>
+      </w:pPr>
+      <w:r>
+        <w:rPr>
+          <w:rFonts w:ascii="Times New Roman" w:hAnsi="Times New Roman"/>
+          <w:b w:val="0"/>
+          <w:i/>
+          <w:color w:val="555555"/>
+          <w:sz w:val="18"/>
+        </w:rPr>
+        <w:t>Denver, CO</w:t>
+      </w:r>
+    </w:p>
+    <w:p>
+      <w:pPr>
+        <w:tabs>
+          <w:tab w:pos="10512" w:val="right"/>
+        </w:tabs>
+        <w:spacing w:before="80" w:after="20"/>
+      </w:pPr>
+      <w:r>
+        <w:rPr>
+          <w:rFonts w:ascii="Times New Roman" w:hAnsi="Times New Roman"/>
+          <w:b/>
+          <w:i w:val="0"/>
+          <w:color w:val="1A1A1A"/>
+          <w:sz w:val="21"/>
+        </w:rPr>
+        <w:t>Co-Owner / Operations Lead</w:t>
+      </w:r>
+      <w:r>
+        <w:rPr>
+          <w:rFonts w:ascii="Times New Roman" w:hAnsi="Times New Roman"/>
+          <w:b w:val="0"/>
+          <w:i w:val="0"/>
+          <w:color w:val="1A1A1A"/>
+          <w:sz w:val="21"/>
+        </w:rPr>
+        <w:t xml:space="preserve">  |  Standing Akimbo</w:t>
+      </w:r>
+      <w:r>
+        <w:rPr>
+          <w:rFonts w:ascii="Times New Roman" w:hAnsi="Times New Roman"/>
+          <w:b w:val="0"/>
+          <w:i w:val="0"/>
+          <w:color w:val="555555"/>
+          <w:sz w:val="18"/>
+        </w:rPr>
+        <w:tab/>
+        <w:t>Jun 2010 - Sep 2012</w:t>
+      </w:r>
+    </w:p>
+    <w:p>
+      <w:pPr>
+        <w:spacing w:after="20"/>
+      </w:pPr>
+      <w:r>
+        <w:rPr>
+          <w:rFonts w:ascii="Times New Roman" w:hAnsi="Times New Roman"/>
+          <w:b w:val="0"/>
+          <w:i/>
+          <w:color w:val="555555"/>
+          <w:sz w:val="18"/>
+        </w:rPr>
+        <w:t>Denver, CO</w:t>
+      </w:r>
+    </w:p>
+    <w:p>
+      <w:pPr>
+        <w:spacing w:after="30"/>
+        <w:ind w:left="259" w:hanging="259"/>
+      </w:pPr>
+      <w:r>
+        <w:rPr>
+          <w:rFonts w:ascii="Times New Roman" w:hAnsi="Times New Roman"/>
+          <w:b w:val="0"/>
+          <w:i w:val="0"/>
+          <w:color w:val="1A1A1A"/>
+        </w:rPr>
+        <w:t xml:space="preserve">•  </w:t>
+      </w:r>
+      <w:r>
+        <w:rPr>
+          <w:rFonts w:ascii="Times New Roman" w:hAnsi="Times New Roman"/>
+          <w:b w:val="0"/>
+          <w:i w:val="0"/>
+          <w:color w:val="1A1A1A"/>
+        </w:rPr>
+        <w:t>Managed new-hire paperwork (I-9s, W-4s, new-hire forms) and employee background checks and state badge requirements in a licensed, state-regulated business.</w:t>
+      </w:r>
+    </w:p>
+    <w:p>
+      <w:pPr>
+        <w:spacing w:after="30"/>
+        <w:ind w:left="259" w:hanging="259"/>
+      </w:pPr>
+      <w:r>
+        <w:rPr>
+          <w:rFonts w:ascii="Times New Roman" w:hAnsi="Times New Roman"/>
+          <w:b w:val="0"/>
+          <w:i w:val="0"/>
+          <w:color w:val="1A1A1A"/>
+        </w:rPr>
+        <w:t xml:space="preserve">•  </w:t>
+      </w:r>
+      <w:r>
+        <w:rPr>
+          <w:rFonts w:ascii="Times New Roman" w:hAnsi="Times New Roman"/>
+          <w:b w:val="0"/>
+          <w:i w:val="0"/>
+          <w:color w:val="1A1A1A"/>
+        </w:rPr>
+        <w:t>Built compliance, intake, and reporting systems from scratch, scaling the business to profitability.</w:t>
       </w:r>
     </w:p>
     <w:p>
@@ -792,7 +834,7 @@
           <w:i w:val="0"/>
           <w:color w:val="1A1A1A"/>
         </w:rPr>
-        <w:t xml:space="preserve">Onboarding &amp; Operations:  </w:t>
+        <w:t xml:space="preserve">Onboarding &amp; Compliance:  </w:t>
       </w:r>
       <w:r>
         <w:rPr>
@@ -801,7 +843,7 @@
           <w:i w:val="0"/>
           <w:color w:val="1A1A1A"/>
         </w:rPr>
-        <w:t>Onboarding Coordination, Documentation &amp; Recordkeeping, Timeline Management, Process Improvement, Data Accuracy</w:t>
+        <w:t>New-Hire Paperwork (I-9, W-4), Background Checks, Timesheet &amp; PTO Approval, Recordkeeping, Deadline Management</w:t>
       </w:r>
     </w:p>
     <w:p>
@@ -815,7 +857,7 @@
           <w:i w:val="0"/>
           <w:color w:val="1A1A1A"/>
         </w:rPr>
-        <w:t xml:space="preserve">Systems:  </w:t>
+        <w:t xml:space="preserve">Systems &amp; Skills:  </w:t>
       </w:r>
       <w:r>
         <w:rPr>
@@ -824,30 +866,7 @@
           <w:i w:val="0"/>
           <w:color w:val="1A1A1A"/>
         </w:rPr>
-        <w:t>Microsoft Excel (experienced), Salesforce, HubSpot, Power BI, Notion, Zapier / Make</w:t>
-      </w:r>
-    </w:p>
-    <w:p>
-      <w:pPr>
-        <w:spacing w:after="30"/>
-      </w:pPr>
-      <w:r>
-        <w:rPr>
-          <w:rFonts w:ascii="Times New Roman" w:hAnsi="Times New Roman"/>
-          <w:b/>
-          <w:i w:val="0"/>
-          <w:color w:val="1A1A1A"/>
-        </w:rPr>
-        <w:t xml:space="preserve">Professional:  </w:t>
-      </w:r>
-      <w:r>
-        <w:rPr>
-          <w:rFonts w:ascii="Times New Roman" w:hAnsi="Times New Roman"/>
-          <w:b w:val="0"/>
-          <w:i w:val="0"/>
-          <w:color w:val="1A1A1A"/>
-        </w:rPr>
-        <w:t>Team Leadership, Written &amp; Verbal Communication, Customer &amp; Stakeholder Coordination, Problem Solving</w:t>
+        <w:t>Excel (experienced), Word, Outlook, Salesforce, HubSpot, Basic Bookkeeping, Team Leadership</w:t>
       </w:r>
     </w:p>
     <w:p>

</xml_diff>